<commit_message>
Rebrand proposal platform as CORE AI and add dual-logo cover
Replace every GoHighLevel mention with CORE AI, the platform CORE AI puts
forward as the proposal's issuer. The cover now carries two logos — the
school's at the top and CORE AI's as the issuing party — and the issuer
appears in the cover table, the signature block and the page footer.

The generator resolves both logo files independently and falls back to a
dashed placeholder frame for whichever image is missing.

Co-Authored-By: Claude Opus 5 <noreply@anthropic.com>
Claude-Session: https://claude.ai/code/session_014bXuhxf1Y7bZKAEdCVgovW
</commit_message>
<xml_diff>
--- a/propuestas/san-guillermo/Propuesta_Matriculas_Colegio_San_Guillermo.docx
+++ b/propuestas/san-guillermo/Propuesta_Matriculas_Colegio_San_Guillermo.docx
@@ -16,7 +16,7 @@
     </w:p>
     <w:p>
       <w:pPr>
-        <w:spacing w:after="0" w:before="900"/>
+        <w:spacing w:after="0" w:before="400"/>
         <w:jc w:val="center"/>
       </w:pPr>
       <w:r>
@@ -33,7 +33,7 @@
     </w:p>
     <w:p>
       <w:pPr>
-        <w:spacing w:after="0" w:before="900"/>
+        <w:spacing w:after="0" w:before="500"/>
         <w:jc w:val="center"/>
       </w:pPr>
       <w:r>
@@ -46,7 +46,7 @@
     </w:p>
     <w:tbl>
       <w:tblPr>
-        <w:tblW w:type="dxa" w:w="2200"/>
+        <w:tblW w:type="dxa" w:w="1950"/>
         <w:jc w:val="center"/>
         <w:tblBorders>
           <w:top w:val="dashed" w:color="BFBFBF" w:sz="6"/>
@@ -58,20 +58,20 @@
         </w:tblBorders>
       </w:tblPr>
       <w:tblGrid>
-        <w:gridCol w:w="2200"/>
+        <w:gridCol w:w="1950"/>
       </w:tblGrid>
       <w:tr>
         <w:trPr>
-          <w:trHeight w:val="2200" w:hRule="atLeast"/>
+          <w:trHeight w:val="1820" w:hRule="atLeast"/>
         </w:trPr>
         <w:tc>
           <w:tcPr>
-            <w:tcW w:type="dxa" w:w="2200"/>
-            <w:tcMar>
-              <w:top w:type="dxa" w:w="200"/>
-              <w:left w:type="dxa" w:w="120"/>
-              <w:bottom w:type="dxa" w:w="200"/>
-              <w:right w:type="dxa" w:w="120"/>
+            <w:tcW w:type="dxa" w:w="1950"/>
+            <w:tcMar>
+              <w:top w:type="dxa" w:w="120"/>
+              <w:left w:type="dxa" w:w="100"/>
+              <w:bottom w:type="dxa" w:w="120"/>
+              <w:right w:type="dxa" w:w="100"/>
             </w:tcMar>
             <w:vAlign w:val="center"/>
           </w:tcPr>
@@ -87,8 +87,8 @@
                 <w:bCs/>
                 <w:color w:val="BFBFBF"/>
                 <w:spacing w:val="60"/>
-                <w:sz w:val="20"/>
-                <w:szCs w:val="20"/>
+                <w:sz w:val="18"/>
+                <w:szCs w:val="18"/>
               </w:rPr>
               <w:t xml:space="preserve">LOGO</w:t>
             </w:r>
@@ -104,8 +104,8 @@
                 <w:i/>
                 <w:iCs/>
                 <w:color w:val="BFBFBF"/>
-                <w:sz w:val="15"/>
-                <w:szCs w:val="15"/>
+                <w:sz w:val="14"/>
+                <w:szCs w:val="14"/>
               </w:rPr>
               <w:t xml:space="preserve">Colegio San Guillermo</w:t>
             </w:r>
@@ -118,7 +118,7 @@
         <w:pBdr>
           <w:bottom w:val="single" w:color="2E75B6" w:sz="18" w:space="10"/>
         </w:pBdr>
-        <w:spacing w:after="0" w:before="700"/>
+        <w:spacing w:after="0" w:before="500"/>
         <w:jc w:val="center"/>
       </w:pPr>
       <w:r>
@@ -136,7 +136,7 @@
     </w:p>
     <w:p>
       <w:pPr>
-        <w:spacing w:after="100" w:before="380"/>
+        <w:spacing w:after="80" w:before="300"/>
         <w:jc w:val="center"/>
       </w:pPr>
       <w:r>
@@ -145,30 +145,30 @@
           <w:b/>
           <w:bCs/>
           <w:color w:val="1F3864"/>
-          <w:sz w:val="52"/>
-          <w:szCs w:val="52"/>
+          <w:sz w:val="48"/>
+          <w:szCs w:val="48"/>
         </w:rPr>
         <w:t xml:space="preserve">Optimización del Proceso de Matrículas</w:t>
       </w:r>
     </w:p>
     <w:p>
       <w:pPr>
-        <w:spacing w:after="260" w:before="0"/>
+        <w:spacing w:after="200" w:before="0"/>
         <w:jc w:val="center"/>
       </w:pPr>
       <w:r>
         <w:rPr>
           <w:rFonts w:ascii="Calibri" w:cs="Calibri" w:eastAsia="Calibri" w:hAnsi="Calibri"/>
           <w:color w:val="2E75B6"/>
-          <w:sz w:val="28"/>
-          <w:szCs w:val="28"/>
+          <w:sz w:val="26"/>
+          <w:szCs w:val="26"/>
         </w:rPr>
         <w:t xml:space="preserve">mediante automatización con Inteligencia Artificial</w:t>
       </w:r>
     </w:p>
     <w:p>
       <w:pPr>
-        <w:spacing w:after="60" w:before="500"/>
+        <w:spacing w:after="60" w:before="340"/>
         <w:jc w:val="center"/>
       </w:pPr>
       <w:r>
@@ -192,8 +192,8 @@
           <w:b/>
           <w:bCs/>
           <w:color w:val="1F3864"/>
-          <w:sz w:val="32"/>
-          <w:szCs w:val="32"/>
+          <w:sz w:val="30"/>
+          <w:szCs w:val="30"/>
         </w:rPr>
         <w:t xml:space="preserve">Colegio San Guillermo</w:t>
       </w:r>
@@ -215,7 +215,7 @@
     </w:p>
     <w:p>
       <w:pPr>
-        <w:spacing w:after="600"/>
+        <w:spacing w:after="360"/>
         <w:jc w:val="center"/>
       </w:pPr>
       <w:r>
@@ -271,7 +271,7 @@
                 <w:sz w:val="20"/>
                 <w:szCs w:val="20"/>
               </w:rPr>
-              <w:t xml:space="preserve">Dirigida a</w:t>
+              <w:t xml:space="preserve">Preparada por</w:t>
             </w:r>
           </w:p>
         </w:tc>
@@ -298,7 +298,7 @@
                 <w:sz w:val="20"/>
                 <w:szCs w:val="20"/>
               </w:rPr>
-              <w:t xml:space="preserve">Sr. Enzo Ramírez Schuchhardt — Sostenedor</w:t>
+              <w:t xml:space="preserve">CORE AI — Automatización de procesos con inteligencia artificial</w:t>
             </w:r>
           </w:p>
         </w:tc>
@@ -324,38 +324,40 @@
             <w:r>
               <w:rPr>
                 <w:rFonts w:ascii="Calibri" w:cs="Calibri" w:eastAsia="Calibri" w:hAnsi="Calibri"/>
+                <w:b/>
+                <w:bCs/>
+                <w:color w:val="1F3864"/>
+                <w:sz w:val="20"/>
+                <w:szCs w:val="20"/>
+              </w:rPr>
+              <w:t xml:space="preserve">Dirigida a</w:t>
+            </w:r>
+          </w:p>
+        </w:tc>
+        <w:tc>
+          <w:tcPr>
+            <w:tcW w:type="dxa" w:w="6460"/>
+            <w:tcMar>
+              <w:top w:type="dxa" w:w="100"/>
+              <w:left w:type="dxa" w:w="120"/>
+              <w:bottom w:type="dxa" w:w="100"/>
+              <w:right w:type="dxa" w:w="120"/>
+            </w:tcMar>
+            <w:vAlign w:val="center"/>
+          </w:tcPr>
+          <w:p>
+            <w:pPr>
+              <w:spacing w:after="0" w:line="260"/>
+              <w:jc w:val="left"/>
+            </w:pPr>
+            <w:r>
+              <w:rPr>
+                <w:rFonts w:ascii="Calibri" w:cs="Calibri" w:eastAsia="Calibri" w:hAnsi="Calibri"/>
                 <w:color w:val="333333"/>
                 <w:sz w:val="20"/>
                 <w:szCs w:val="20"/>
               </w:rPr>
-              <w:t xml:space="preserve"/>
-            </w:r>
-          </w:p>
-        </w:tc>
-        <w:tc>
-          <w:tcPr>
-            <w:tcW w:type="dxa" w:w="6460"/>
-            <w:tcMar>
-              <w:top w:type="dxa" w:w="100"/>
-              <w:left w:type="dxa" w:w="120"/>
-              <w:bottom w:type="dxa" w:w="100"/>
-              <w:right w:type="dxa" w:w="120"/>
-            </w:tcMar>
-            <w:vAlign w:val="center"/>
-          </w:tcPr>
-          <w:p>
-            <w:pPr>
-              <w:spacing w:after="0" w:line="260"/>
-              <w:jc w:val="left"/>
-            </w:pPr>
-            <w:r>
-              <w:rPr>
-                <w:rFonts w:ascii="Calibri" w:cs="Calibri" w:eastAsia="Calibri" w:hAnsi="Calibri"/>
-                <w:color w:val="333333"/>
-                <w:sz w:val="20"/>
-                <w:szCs w:val="20"/>
-              </w:rPr>
-              <w:t xml:space="preserve">Sr. Andrés Reyes — Director</w:t>
+              <w:t xml:space="preserve">Sr. Enzo Ramírez Schuchhardt — Sostenedor</w:t>
             </w:r>
           </w:p>
         </w:tc>
@@ -381,13 +383,11 @@
             <w:r>
               <w:rPr>
                 <w:rFonts w:ascii="Calibri" w:cs="Calibri" w:eastAsia="Calibri" w:hAnsi="Calibri"/>
-                <w:b/>
-                <w:bCs/>
-                <w:color w:val="1F3864"/>
-                <w:sz w:val="20"/>
-                <w:szCs w:val="20"/>
-              </w:rPr>
-              <w:t xml:space="preserve">Alcance</w:t>
+                <w:color w:val="333333"/>
+                <w:sz w:val="20"/>
+                <w:szCs w:val="20"/>
+              </w:rPr>
+              <w:t xml:space="preserve"/>
             </w:r>
           </w:p>
         </w:tc>
@@ -414,7 +414,7 @@
                 <w:sz w:val="20"/>
                 <w:szCs w:val="20"/>
               </w:rPr>
-              <w:t xml:space="preserve">Exclusivamente el proceso de matrículas: captación, información, agendamiento, documentación y confirmación</w:t>
+              <w:t xml:space="preserve">Sr. Andrés Reyes — Director</w:t>
             </w:r>
           </w:p>
         </w:tc>
@@ -446,7 +446,7 @@
                 <w:sz w:val="20"/>
                 <w:szCs w:val="20"/>
               </w:rPr>
-              <w:t xml:space="preserve">Fecha</w:t>
+              <w:t xml:space="preserve">Alcance</w:t>
             </w:r>
           </w:p>
         </w:tc>
@@ -473,7 +473,7 @@
                 <w:sz w:val="20"/>
                 <w:szCs w:val="20"/>
               </w:rPr>
-              <w:t xml:space="preserve">Agosto de 2026</w:t>
+              <w:t xml:space="preserve">Exclusivamente el proceso de matrículas: captación, información, agendamiento, documentación y confirmación</w:t>
             </w:r>
           </w:p>
         </w:tc>
@@ -505,6 +505,65 @@
                 <w:sz w:val="20"/>
                 <w:szCs w:val="20"/>
               </w:rPr>
+              <w:t xml:space="preserve">Fecha</w:t>
+            </w:r>
+          </w:p>
+        </w:tc>
+        <w:tc>
+          <w:tcPr>
+            <w:tcW w:type="dxa" w:w="6460"/>
+            <w:tcMar>
+              <w:top w:type="dxa" w:w="100"/>
+              <w:left w:type="dxa" w:w="120"/>
+              <w:bottom w:type="dxa" w:w="100"/>
+              <w:right w:type="dxa" w:w="120"/>
+            </w:tcMar>
+            <w:vAlign w:val="center"/>
+          </w:tcPr>
+          <w:p>
+            <w:pPr>
+              <w:spacing w:after="0" w:line="260"/>
+              <w:jc w:val="left"/>
+            </w:pPr>
+            <w:r>
+              <w:rPr>
+                <w:rFonts w:ascii="Calibri" w:cs="Calibri" w:eastAsia="Calibri" w:hAnsi="Calibri"/>
+                <w:color w:val="333333"/>
+                <w:sz w:val="20"/>
+                <w:szCs w:val="20"/>
+              </w:rPr>
+              <w:t xml:space="preserve">Agosto de 2026</w:t>
+            </w:r>
+          </w:p>
+        </w:tc>
+      </w:tr>
+      <w:tr>
+        <w:tc>
+          <w:tcPr>
+            <w:tcW w:type="dxa" w:w="2900"/>
+            <w:shd w:fill="EAF0F8" w:color="auto" w:val="clear"/>
+            <w:tcMar>
+              <w:top w:type="dxa" w:w="100"/>
+              <w:left w:type="dxa" w:w="120"/>
+              <w:bottom w:type="dxa" w:w="100"/>
+              <w:right w:type="dxa" w:w="120"/>
+            </w:tcMar>
+            <w:vAlign w:val="center"/>
+          </w:tcPr>
+          <w:p>
+            <w:pPr>
+              <w:spacing w:after="0" w:line="260"/>
+              <w:jc w:val="left"/>
+            </w:pPr>
+            <w:r>
+              <w:rPr>
+                <w:rFonts w:ascii="Calibri" w:cs="Calibri" w:eastAsia="Calibri" w:hAnsi="Calibri"/>
+                <w:b/>
+                <w:bCs/>
+                <w:color w:val="1F3864"/>
+                <w:sz w:val="20"/>
+                <w:szCs w:val="20"/>
+              </w:rPr>
               <w:t xml:space="preserve">Validez de la oferta</w:t>
             </w:r>
           </w:p>
@@ -538,6 +597,138 @@
         </w:tc>
       </w:tr>
     </w:tbl>
+    <w:p>
+      <w:pPr>
+        <w:spacing w:after="0" w:before="420"/>
+        <w:jc w:val="center"/>
+      </w:pPr>
+      <w:r>
+        <w:rPr>
+          <w:sz w:val="2"/>
+          <w:szCs w:val="2"/>
+        </w:rPr>
+        <w:t xml:space="preserve"/>
+      </w:r>
+    </w:p>
+    <w:tbl>
+      <w:tblPr>
+        <w:tblW w:type="dxa" w:w="1200"/>
+        <w:jc w:val="center"/>
+        <w:tblBorders>
+          <w:top w:val="dashed" w:color="BFBFBF" w:sz="6"/>
+          <w:left w:val="dashed" w:color="BFBFBF" w:sz="6"/>
+          <w:bottom w:val="dashed" w:color="BFBFBF" w:sz="6"/>
+          <w:right w:val="dashed" w:color="BFBFBF" w:sz="6"/>
+          <w:insideH w:val="single" w:color="auto" w:sz="4"/>
+          <w:insideV w:val="single" w:color="auto" w:sz="4"/>
+        </w:tblBorders>
+      </w:tblPr>
+      <w:tblGrid>
+        <w:gridCol w:w="1200"/>
+      </w:tblGrid>
+      <w:tr>
+        <w:trPr>
+          <w:trHeight w:val="1120" w:hRule="atLeast"/>
+        </w:trPr>
+        <w:tc>
+          <w:tcPr>
+            <w:tcW w:type="dxa" w:w="1200"/>
+            <w:tcMar>
+              <w:top w:type="dxa" w:w="120"/>
+              <w:left w:type="dxa" w:w="100"/>
+              <w:bottom w:type="dxa" w:w="120"/>
+              <w:right w:type="dxa" w:w="100"/>
+            </w:tcMar>
+            <w:vAlign w:val="center"/>
+          </w:tcPr>
+          <w:p>
+            <w:pPr>
+              <w:spacing w:after="40"/>
+              <w:jc w:val="center"/>
+            </w:pPr>
+            <w:r>
+              <w:rPr>
+                <w:rFonts w:ascii="Calibri" w:cs="Calibri" w:eastAsia="Calibri" w:hAnsi="Calibri"/>
+                <w:b/>
+                <w:bCs/>
+                <w:color w:val="BFBFBF"/>
+                <w:spacing w:val="60"/>
+                <w:sz w:val="18"/>
+                <w:szCs w:val="18"/>
+              </w:rPr>
+              <w:t xml:space="preserve">LOGO</w:t>
+            </w:r>
+          </w:p>
+          <w:p>
+            <w:pPr>
+              <w:spacing w:after="0"/>
+              <w:jc w:val="center"/>
+            </w:pPr>
+            <w:r>
+              <w:rPr>
+                <w:rFonts w:ascii="Calibri" w:cs="Calibri" w:eastAsia="Calibri" w:hAnsi="Calibri"/>
+                <w:i/>
+                <w:iCs/>
+                <w:color w:val="BFBFBF"/>
+                <w:sz w:val="14"/>
+                <w:szCs w:val="14"/>
+              </w:rPr>
+              <w:t xml:space="preserve">CORE AI</w:t>
+            </w:r>
+          </w:p>
+        </w:tc>
+      </w:tr>
+    </w:tbl>
+    <w:p>
+      <w:pPr>
+        <w:spacing w:after="0" w:before="160"/>
+        <w:jc w:val="center"/>
+      </w:pPr>
+      <w:r>
+        <w:rPr>
+          <w:rFonts w:ascii="Calibri" w:cs="Calibri" w:eastAsia="Calibri" w:hAnsi="Calibri"/>
+          <w:color w:val="808080"/>
+          <w:sz w:val="17"/>
+          <w:szCs w:val="17"/>
+        </w:rPr>
+        <w:t xml:space="preserve">Propuesta elaborada y presentada por</w:t>
+      </w:r>
+    </w:p>
+    <w:p>
+      <w:pPr>
+        <w:spacing w:after="0" w:before="40"/>
+        <w:jc w:val="center"/>
+      </w:pPr>
+      <w:r>
+        <w:rPr>
+          <w:rFonts w:ascii="Calibri" w:cs="Calibri" w:eastAsia="Calibri" w:hAnsi="Calibri"/>
+          <w:b/>
+          <w:bCs/>
+          <w:color w:val="1F3864"/>
+          <w:spacing w:val="40"/>
+          <w:sz w:val="26"/>
+          <w:szCs w:val="26"/>
+        </w:rPr>
+        <w:t xml:space="preserve">CORE AI</w:t>
+      </w:r>
+    </w:p>
+    <w:p>
+      <w:pPr>
+        <w:spacing w:after="0" w:before="40"/>
+        <w:jc w:val="center"/>
+      </w:pPr>
+      <w:r>
+        <w:rPr>
+          <w:rFonts w:ascii="Calibri" w:cs="Calibri" w:eastAsia="Calibri" w:hAnsi="Calibri"/>
+          <w:i/>
+          <w:iCs/>
+          <w:color w:val="808080"/>
+          <w:sz w:val="17"/>
+          <w:szCs w:val="17"/>
+        </w:rPr>
+        <w:t xml:space="preserve">Automatización de procesos con inteligencia artificial</w:t>
+      </w:r>
+    </w:p>
     <w:p>
       <w:pPr>
         <w:sectPr>
@@ -1461,7 +1652,7 @@
           <w:sz w:val="21"/>
           <w:szCs w:val="21"/>
         </w:rPr>
-        <w:t xml:space="preserve">Proponemos implementar un sistema de gestión y automatización de matrículas construido sobre la plataforma GoHighLevel, complementada con inteligencia artificial conversacional y de voz. Todo el sistema opera exclusivamente dentro del proceso de matrícula.</w:t>
+        <w:t xml:space="preserve">Proponemos implementar un sistema de gestión y automatización de matrículas construido sobre nuestra plataforma CORE AI, que integra la gestión de contactos, las automatizaciones y la inteligencia artificial conversacional y de voz en un solo lugar. Todo el sistema opera exclusivamente dentro del proceso de matrícula.</w:t>
       </w:r>
     </w:p>
     <w:p>
@@ -2550,7 +2741,7 @@
           <w:sz w:val="24"/>
           <w:szCs w:val="24"/>
         </w:rPr>
-        <w:t xml:space="preserve">3.4  CRM de matrículas en GoHighLevel</w:t>
+        <w:t xml:space="preserve">3.4  CRM de matrículas en CORE AI</w:t>
       </w:r>
     </w:p>
     <w:p>
@@ -3225,7 +3416,7 @@
                 <w:sz w:val="19"/>
                 <w:szCs w:val="19"/>
               </w:rPr>
-              <w:t xml:space="preserve">GoHighLevel</w:t>
+              <w:t xml:space="preserve">CORE AI</w:t>
             </w:r>
           </w:p>
         </w:tc>
@@ -3548,7 +3739,7 @@
                 <w:sz w:val="19"/>
                 <w:szCs w:val="19"/>
               </w:rPr>
-              <w:t xml:space="preserve">Formularios y páginas de captación de GoHighLevel</w:t>
+              <w:t xml:space="preserve">Formularios y páginas de captación CORE AI</w:t>
             </w:r>
           </w:p>
         </w:tc>
@@ -4253,7 +4444,7 @@
                 <w:sz w:val="19"/>
                 <w:szCs w:val="19"/>
               </w:rPr>
-              <w:t xml:space="preserve">Aplicación móvil de GoHighLevel</w:t>
+              <w:t xml:space="preserve">Aplicación móvil CORE AI</w:t>
             </w:r>
           </w:p>
         </w:tc>
@@ -4512,7 +4703,7 @@
                 <w:sz w:val="20"/>
                 <w:szCs w:val="20"/>
               </w:rPr>
-              <w:t xml:space="preserve">GOHIGHLEVEL  +  INTELIGENCIA ARTIFICIAL</w:t>
+              <w:t xml:space="preserve">CORE AI  ·  PLATAFORMA + INTELIGENCIA ARTIFICIAL</w:t>
             </w:r>
           </w:p>
           <w:p>
@@ -9250,7 +9441,7 @@
           <w:sz w:val="21"/>
           <w:szCs w:val="21"/>
         </w:rPr>
-        <w:t xml:space="preserve">Licencia y operación de la plataforma GoHighLevel.</w:t>
+        <w:t xml:space="preserve">Licencia y operación de la plataforma CORE AI.</w:t>
       </w:r>
     </w:p>
     <w:p>
@@ -10307,7 +10498,7 @@
                 <w:sz w:val="19"/>
                 <w:szCs w:val="19"/>
               </w:rPr>
-              <w:t xml:space="preserve">Por el prestador del servicio</w:t>
+              <w:t xml:space="preserve">Por CORE AI</w:t>
             </w:r>
           </w:p>
           <w:p>
@@ -10395,7 +10586,7 @@
         <w:sz w:val="16"/>
         <w:szCs w:val="16"/>
       </w:rPr>
-      <w:t xml:space="preserve">Propuesta comercial  ·  Página </w:t>
+      <w:t xml:space="preserve">CORE AI  ·  Propuesta comercial  ·  Página </w:t>
     </w:r>
     <w:r>
       <w:rPr>

</xml_diff>

<commit_message>
Fit cover logo frames to the real horizontal proportions
Both logos are wide, not square: the school's lockup is 3.53:1 and CORE AI's
is 2.13:1. Width and height are now set independently so neither image is
stretched, and the placeholder frames match those same proportions.

The CORE AI name and tagline in text are dropped when its logo is present,
since the image already carries both.

Co-Authored-By: Claude Opus 5 <noreply@anthropic.com>
Claude-Session: https://claude.ai/code/session_014bXuhxf1Y7bZKAEdCVgovW
</commit_message>
<xml_diff>
--- a/propuestas/san-guillermo/Propuesta_Matriculas_Colegio_San_Guillermo.docx
+++ b/propuestas/san-guillermo/Propuesta_Matriculas_Colegio_San_Guillermo.docx
@@ -33,7 +33,7 @@
     </w:p>
     <w:p>
       <w:pPr>
-        <w:spacing w:after="0" w:before="500"/>
+        <w:spacing w:after="0" w:before="460"/>
         <w:jc w:val="center"/>
       </w:pPr>
       <w:r>
@@ -46,7 +46,7 @@
     </w:p>
     <w:tbl>
       <w:tblPr>
-        <w:tblW w:type="dxa" w:w="1950"/>
+        <w:tblW w:type="dxa" w:w="3750"/>
         <w:jc w:val="center"/>
         <w:tblBorders>
           <w:top w:val="dashed" w:color="BFBFBF" w:sz="6"/>
@@ -58,26 +58,26 @@
         </w:tblBorders>
       </w:tblPr>
       <w:tblGrid>
-        <w:gridCol w:w="1950"/>
+        <w:gridCol w:w="3750"/>
       </w:tblGrid>
       <w:tr>
         <w:trPr>
-          <w:trHeight w:val="1820" w:hRule="atLeast"/>
+          <w:trHeight w:val="1065" w:hRule="atLeast"/>
         </w:trPr>
         <w:tc>
           <w:tcPr>
-            <w:tcW w:type="dxa" w:w="1950"/>
-            <w:tcMar>
-              <w:top w:type="dxa" w:w="120"/>
+            <w:tcW w:type="dxa" w:w="3750"/>
+            <w:tcMar>
+              <w:top w:type="dxa" w:w="80"/>
               <w:left w:type="dxa" w:w="100"/>
-              <w:bottom w:type="dxa" w:w="120"/>
+              <w:bottom w:type="dxa" w:w="80"/>
               <w:right w:type="dxa" w:w="100"/>
             </w:tcMar>
             <w:vAlign w:val="center"/>
           </w:tcPr>
           <w:p>
             <w:pPr>
-              <w:spacing w:after="40"/>
+              <w:spacing w:after="30"/>
               <w:jc w:val="center"/>
             </w:pPr>
             <w:r>
@@ -599,7 +599,22 @@
     </w:tbl>
     <w:p>
       <w:pPr>
-        <w:spacing w:after="0" w:before="420"/>
+        <w:spacing w:after="0" w:before="400"/>
+        <w:jc w:val="center"/>
+      </w:pPr>
+      <w:r>
+        <w:rPr>
+          <w:rFonts w:ascii="Calibri" w:cs="Calibri" w:eastAsia="Calibri" w:hAnsi="Calibri"/>
+          <w:color w:val="808080"/>
+          <w:sz w:val="17"/>
+          <w:szCs w:val="17"/>
+        </w:rPr>
+        <w:t xml:space="preserve">Propuesta elaborada y presentada por</w:t>
+      </w:r>
+    </w:p>
+    <w:p>
+      <w:pPr>
+        <w:spacing w:after="0" w:before="120"/>
         <w:jc w:val="center"/>
       </w:pPr>
       <w:r>
@@ -612,7 +627,7 @@
     </w:p>
     <w:tbl>
       <w:tblPr>
-        <w:tblW w:type="dxa" w:w="1200"/>
+        <w:tblW w:type="dxa" w:w="3225"/>
         <w:jc w:val="center"/>
         <w:tblBorders>
           <w:top w:val="dashed" w:color="BFBFBF" w:sz="6"/>
@@ -624,26 +639,26 @@
         </w:tblBorders>
       </w:tblPr>
       <w:tblGrid>
-        <w:gridCol w:w="1200"/>
+        <w:gridCol w:w="3225"/>
       </w:tblGrid>
       <w:tr>
         <w:trPr>
-          <w:trHeight w:val="1120" w:hRule="atLeast"/>
+          <w:trHeight w:val="1515" w:hRule="atLeast"/>
         </w:trPr>
         <w:tc>
           <w:tcPr>
-            <w:tcW w:type="dxa" w:w="1200"/>
-            <w:tcMar>
-              <w:top w:type="dxa" w:w="120"/>
+            <w:tcW w:type="dxa" w:w="3225"/>
+            <w:tcMar>
+              <w:top w:type="dxa" w:w="80"/>
               <w:left w:type="dxa" w:w="100"/>
-              <w:bottom w:type="dxa" w:w="120"/>
+              <w:bottom w:type="dxa" w:w="80"/>
               <w:right w:type="dxa" w:w="100"/>
             </w:tcMar>
             <w:vAlign w:val="center"/>
           </w:tcPr>
           <w:p>
             <w:pPr>
-              <w:spacing w:after="40"/>
+              <w:spacing w:after="30"/>
               <w:jc w:val="center"/>
             </w:pPr>
             <w:r>
@@ -681,22 +696,7 @@
     </w:tbl>
     <w:p>
       <w:pPr>
-        <w:spacing w:after="0" w:before="160"/>
-        <w:jc w:val="center"/>
-      </w:pPr>
-      <w:r>
-        <w:rPr>
-          <w:rFonts w:ascii="Calibri" w:cs="Calibri" w:eastAsia="Calibri" w:hAnsi="Calibri"/>
-          <w:color w:val="808080"/>
-          <w:sz w:val="17"/>
-          <w:szCs w:val="17"/>
-        </w:rPr>
-        <w:t xml:space="preserve">Propuesta elaborada y presentada por</w:t>
-      </w:r>
-    </w:p>
-    <w:p>
-      <w:pPr>
-        <w:spacing w:after="0" w:before="40"/>
+        <w:spacing w:after="0" w:before="120"/>
         <w:jc w:val="center"/>
       </w:pPr>
       <w:r>

</xml_diff>